<commit_message>
changing before trying color stuff
</commit_message>
<xml_diff>
--- a/Resume.docx
+++ b/Resume.docx
@@ -335,7 +335,7 @@
         <w:rPr>
           <w:spacing w:val="12"/>
         </w:rPr>
-        <w:t>Created chatbots for WSA events trained on data of the sessions, workshops, locations, speakers, winners, attendees, sponsors and visa info to help attendees navigate the event.</w:t>
+        <w:t>Created chatbots for WSA events with access to data on the sessions, workshops, locations, speakers, winners, attendees, sponsors and visa info to help attendees navigate the event.</w:t>
       </w:r>
     </w:p>
     <w:p>
@@ -476,7 +476,7 @@
         <w:rPr>
           <w:spacing w:val="12"/>
         </w:rPr>
-        <w:t>Proposed and ran 15+ A/B experiments on the SwissBorg website, using the dev team's existing testing setup and adding Hotjar, to grow app downloads and upsell conversion.</w:t>
+        <w:t>Proposed and ran 15+ A/B experiments on the SwissBorg website, using the dev team's existing testing setup and adding Hotjar, doubling the website's conversion rate.</w:t>
       </w:r>
     </w:p>
     <w:p>
@@ -999,7 +999,9 @@
         <w:rPr>
           <w:spacing w:val="12"/>
         </w:rPr>
-        <w:t>Figma, Storybook, Adobe CS, Design systems, Prototyping, Micro-animations, Motion Graphics, Visual design</w:t>
+        <w:t>Figma, Storybook, Adobe CS, Design systems, Figma prototyping, Micro</w:t>
+        <w:noBreakHyphen/>
+        <w:t xml:space="preserve">animations, Motion Graphics, Visual design</w:t>
       </w:r>
     </w:p>
     <w:p>

</xml_diff>